<commit_message>
Sửa lỗi nhập sai
</commit_message>
<xml_diff>
--- a/LAB1/[IT005.R17.2]-25521963-25522037_Lab1.docx
+++ b/LAB1/[IT005.R17.2]-25521963-25522037_Lab1.docx
@@ -1675,6 +1675,7 @@
       <w:r>
         <w:rPr>
           <w:rFonts w:ascii="Times New Roman" w:hAnsi="Times New Roman"/>
+          <w:noProof/>
         </w:rPr>
         <w:lastRenderedPageBreak/>
         <w:drawing>
@@ -1755,6 +1756,7 @@
       <w:r>
         <w:rPr>
           <w:rFonts w:ascii="Times New Roman" w:hAnsi="Times New Roman"/>
+          <w:noProof/>
         </w:rPr>
         <w:drawing>
           <wp:inline distT="0" distB="0" distL="0" distR="0" wp14:anchorId="6005B5FB" wp14:editId="56234CDA">
@@ -1834,6 +1836,7 @@
       <w:r>
         <w:rPr>
           <w:rFonts w:ascii="Times New Roman" w:hAnsi="Times New Roman"/>
+          <w:noProof/>
         </w:rPr>
         <w:lastRenderedPageBreak/>
         <w:drawing>
@@ -3663,6 +3666,9 @@
         <w:jc w:val="center"/>
       </w:pPr>
       <w:r>
+        <w:rPr>
+          <w:noProof/>
+        </w:rPr>
         <w:drawing>
           <wp:inline distT="0" distB="0" distL="0" distR="0" wp14:anchorId="6AC46047" wp14:editId="0D890B5E">
             <wp:extent cx="6457950" cy="1487170"/>
@@ -3709,27 +3715,13 @@
           <w:i/>
           <w:iCs/>
         </w:rPr>
-        <w:t>Hình 2.3.</w:t>
+        <w:t xml:space="preserve">Hình 2.3.2 </w:t>
       </w:r>
       <w:r>
         <w:rPr>
           <w:i/>
           <w:iCs/>
         </w:rPr>
-        <w:t>2</w:t>
-      </w:r>
-      <w:r>
-        <w:rPr>
-          <w:i/>
-          <w:iCs/>
-        </w:rPr>
-        <w:t xml:space="preserve"> </w:t>
-      </w:r>
-      <w:r>
-        <w:rPr>
-          <w:i/>
-          <w:iCs/>
-        </w:rPr>
         <w:t>Các gói tin liên quan đến website thứ hai sau khi lọc theo địa chỉ IP</w:t>
       </w:r>
     </w:p>
@@ -3775,10 +3767,7 @@
       </w:pPr>
       <w:r>
         <w:tab/>
-        <w:t xml:space="preserve">- </w:t>
-      </w:r>
-      <w:r>
-        <w:t>Từ hình trên, ta thấy:</w:t>
+        <w:t>- Từ hình trên, ta thấy:</w:t>
       </w:r>
     </w:p>
     <w:p>
@@ -3791,19 +3780,13 @@
         <w:jc w:val="both"/>
       </w:pPr>
       <w:r>
-        <w:t>Gói tin [SYN] đầu tiên mà máy ta (Client) gửi yêu cầu tới máy chủ là gói tin No.</w:t>
-      </w:r>
-      <w:r>
-        <w:t>3</w:t>
+        <w:t>Gói tin [SYN] đầu tiên mà máy ta (Client) gửi yêu cầu tới máy chủ là gói tin No.3</w:t>
       </w:r>
       <w:r>
         <w:t>4</w:t>
       </w:r>
       <w:r>
-        <w:t>65</w:t>
-      </w:r>
-      <w:r>
-        <w:t xml:space="preserve"> ở thờ</w:t>
+        <w:t>65 ở thờ</w:t>
       </w:r>
       <w:r>
         <w:t xml:space="preserve">i </w:t>
@@ -3940,22 +3923,13 @@
         <w:t xml:space="preserve">= t2-t1 = </w:t>
       </w:r>
       <w:r>
-        <w:t>8.8050189</w:t>
-      </w:r>
-      <w:r>
-        <w:t xml:space="preserve"> - </w:t>
-      </w:r>
-      <w:r>
-        <w:t>8.0076416</w:t>
+        <w:t>8.8050189 - 8.0076416</w:t>
       </w:r>
       <w:r>
         <w:t xml:space="preserve"> = </w:t>
       </w:r>
       <w:r>
-        <w:t>0.7973773</w:t>
-      </w:r>
-      <w:r>
-        <w:t xml:space="preserve"> </w:t>
+        <w:t xml:space="preserve">0.7973773 </w:t>
       </w:r>
       <w:r>
         <w:t>(s).</w:t>
@@ -3987,27 +3961,20 @@
           <w:i w:val="0"/>
           <w:iCs/>
         </w:rPr>
-        <w:t xml:space="preserve">4 </w:t>
+        <w:t xml:space="preserve">4 Nội dung hiển thị trên trang </w:t>
       </w:r>
       <w:r>
         <w:rPr>
           <w:i w:val="0"/>
           <w:iCs/>
         </w:rPr>
-        <w:t xml:space="preserve">Nội dung hiển thị trên trang </w:t>
+        <w:t>website</w:t>
       </w:r>
       <w:r>
         <w:rPr>
           <w:i w:val="0"/>
           <w:iCs/>
         </w:rPr>
-        <w:t>website</w:t>
-      </w:r>
-      <w:r>
-        <w:rPr>
-          <w:i w:val="0"/>
-          <w:iCs/>
-        </w:rPr>
         <w:t xml:space="preserve"> gaia.cs.umass.edu “Congratulations! You've downloaded the first Wireshark lab file!” có nằm trong các gói tin HTTP bắt được hay không? Nếu có, hãy tìm và xác định vị trí của nội dung này trong các gói tin bắt được.</w:t>
       </w:r>
     </w:p>
@@ -4016,6 +3983,9 @@
         <w:jc w:val="center"/>
       </w:pPr>
       <w:r>
+        <w:rPr>
+          <w:noProof/>
+        </w:rPr>
         <w:lastRenderedPageBreak/>
         <w:drawing>
           <wp:inline distT="0" distB="0" distL="0" distR="0" wp14:anchorId="4FC992A8" wp14:editId="3AB02BCA">
@@ -4092,8 +4062,6 @@
       </w:pPr>
       <w:r>
         <w:tab/>
-      </w:r>
-      <w:r>
         <w:t>Trong các gói tin HTTP ta bắt đ</w:t>
       </w:r>
       <w:r>
@@ -4218,7 +4186,13 @@
         <w:t>gaia.cs.umass.edu</w:t>
       </w:r>
       <w:r>
-        <w:t xml:space="preserve"> là: 128.199.245.12</w:t>
+        <w:t xml:space="preserve"> là: 128.1</w:t>
+      </w:r>
+      <w:r>
+        <w:t>1</w:t>
+      </w:r>
+      <w:r>
+        <w:t>9.245.12</w:t>
       </w:r>
     </w:p>
     <w:p>
@@ -4226,6 +4200,9 @@
         <w:jc w:val="center"/>
       </w:pPr>
       <w:r>
+        <w:rPr>
+          <w:noProof/>
+        </w:rPr>
         <w:drawing>
           <wp:inline distT="0" distB="0" distL="0" distR="0" wp14:anchorId="13D3013F" wp14:editId="20E391C6">
             <wp:extent cx="6005080" cy="198137"/>
@@ -4331,6 +4308,9 @@
         <w:jc w:val="center"/>
       </w:pPr>
       <w:r>
+        <w:rPr>
+          <w:noProof/>
+        </w:rPr>
         <w:drawing>
           <wp:inline distT="0" distB="0" distL="0" distR="0" wp14:anchorId="773155CD" wp14:editId="6A2C3761">
             <wp:extent cx="6457950" cy="929005"/>
@@ -4430,10 +4410,7 @@
         <w:t xml:space="preserve"> uit.edu.vn</w:t>
       </w:r>
       <w:r>
-        <w:t xml:space="preserve"> là: </w:t>
-      </w:r>
-      <w:r>
-        <w:t>118.69.123.140</w:t>
+        <w:t xml:space="preserve"> là: 118.69.123.140</w:t>
       </w:r>
     </w:p>
     <w:p>
@@ -4450,6 +4427,9 @@
         <w:jc w:val="center"/>
       </w:pPr>
       <w:r>
+        <w:rPr>
+          <w:noProof/>
+        </w:rPr>
         <w:lastRenderedPageBreak/>
         <w:drawing>
           <wp:inline distT="0" distB="0" distL="0" distR="0" wp14:anchorId="7D5E1098" wp14:editId="24BD91AB">
@@ -4527,31 +4507,7 @@
         <w:t xml:space="preserve">- </w:t>
       </w:r>
       <w:r>
-        <w:t>Đây là các gói tin sau khi ta sử dụng bộ lọc http, ta thấy rằng, ở ở trên cùng, là gói</w:t>
-      </w:r>
-      <w:r>
-        <w:t xml:space="preserve"> </w:t>
-      </w:r>
-      <w:r>
-        <w:t>mà ta gửi</w:t>
-      </w:r>
-      <w:r>
-        <w:t xml:space="preserve"> </w:t>
-      </w:r>
-      <w:r>
-        <w:t>request từ máy ta lên server. Do đó, địa chỉ của máy ta lúc này là Source,</w:t>
-      </w:r>
-      <w:r>
-        <w:t xml:space="preserve"> </w:t>
-      </w:r>
-      <w:r>
-        <w:t>hay nói cách khác, địa chỉ IP của máy tính ta đang dùng là</w:t>
-      </w:r>
-      <w:r>
-        <w:t xml:space="preserve"> 10.45.168.211</w:t>
-      </w:r>
-      <w:r>
-        <w:t>.</w:t>
+        <w:t>Đây là các gói tin sau khi ta sử dụng bộ lọc http, ta thấy rằng, ở ở trên cùng, là gói mà ta gửi request từ máy ta lên server. Do đó, địa chỉ của máy ta lúc này là Source, hay nói cách khác, địa chỉ IP của máy tính ta đang dùng là 10.45.168.211.</w:t>
       </w:r>
     </w:p>
     <w:p>
@@ -4574,7 +4530,7 @@
           <w:i w:val="0"/>
           <w:iCs/>
         </w:rPr>
-        <w:t>2.</w:t>
+        <w:t xml:space="preserve">2.6 </w:t>
       </w:r>
       <w:r>
         <w:rPr>
@@ -4582,7 +4538,7 @@
           <w:i w:val="0"/>
           <w:iCs/>
         </w:rPr>
-        <w:t>6</w:t>
+        <w:t xml:space="preserve">Qua ví dụ bắt gói tin trên và kết quả bắt gói tin từ Wireshark, hãy mô tả ngắn gọn diễn biến xảy ra khi bắt đầu truy cập vào một đường dẫn đến một trang </w:t>
       </w:r>
       <w:r>
         <w:rPr>
@@ -4590,7 +4546,7 @@
           <w:i w:val="0"/>
           <w:iCs/>
         </w:rPr>
-        <w:t xml:space="preserve"> </w:t>
+        <w:t>website</w:t>
       </w:r>
       <w:r>
         <w:rPr>
@@ -4598,7 +4554,7 @@
           <w:i w:val="0"/>
           <w:iCs/>
         </w:rPr>
-        <w:t xml:space="preserve">Qua ví dụ bắt gói tin trên và kết quả bắt gói tin từ Wireshark, hãy mô tả ngắn gọn diễn biến xảy ra khi bắt đầu truy cập vào một đường dẫn đến một trang </w:t>
+        <w:t xml:space="preserve"> cho đến lúc xem được các nội dung trên trang </w:t>
       </w:r>
       <w:r>
         <w:rPr>
@@ -4614,22 +4570,6 @@
           <w:i w:val="0"/>
           <w:iCs/>
         </w:rPr>
-        <w:t xml:space="preserve"> cho đến lúc xem được các nội dung trên trang </w:t>
-      </w:r>
-      <w:r>
-        <w:rPr>
-          <w:rFonts w:ascii="Times New Roman" w:hAnsi="Times New Roman" w:cs="Times New Roman"/>
-          <w:i w:val="0"/>
-          <w:iCs/>
-        </w:rPr>
-        <w:t>website</w:t>
-      </w:r>
-      <w:r>
-        <w:rPr>
-          <w:rFonts w:ascii="Times New Roman" w:hAnsi="Times New Roman" w:cs="Times New Roman"/>
-          <w:i w:val="0"/>
-          <w:iCs/>
-        </w:rPr>
         <w:t xml:space="preserve"> đó.</w:t>
       </w:r>
     </w:p>
@@ -4642,10 +4582,7 @@
         <w:t xml:space="preserve">- </w:t>
       </w:r>
       <w:r>
-        <w:t>Khi người dùng truy cập một tên miền, trình duyệt hoặc hệ điều hành thực hiện truy vấn DNS để phân giải tên miền thành một hoặc nhiều địa chỉ IP của máy chủ/dịch vụ tương ứng.</w:t>
-      </w:r>
-      <w:r>
-        <w:t xml:space="preserve"> </w:t>
+        <w:t xml:space="preserve">Khi người dùng truy cập một tên miền, trình duyệt hoặc hệ điều hành thực hiện truy vấn DNS để phân giải tên miền thành một hoặc nhiều địa chỉ IP của máy chủ/dịch vụ tương ứng. </w:t>
       </w:r>
       <w:r>
         <w:t>Khi tìm thấy địa chỉ IP, địa chỉ IP đó sẽ đ</w:t>
@@ -4684,13 +4621,7 @@
         <w:t>website</w:t>
       </w:r>
       <w:r>
-        <w:t xml:space="preserve"> thứ</w:t>
-      </w:r>
-      <w:r>
-        <w:t xml:space="preserve"> </w:t>
-      </w:r>
-      <w:r>
-        <w:t xml:space="preserve">nhất ở trên). Sau đó, trình duyệt sẽ truy xuất mã HTML của trang </w:t>
+        <w:t xml:space="preserve"> thứ nhất ở trên). Sau đó, trình duyệt sẽ truy xuất mã HTML của trang </w:t>
       </w:r>
       <w:r>
         <w:t>website</w:t>
@@ -4705,13 +4636,7 @@
         <w:t>ư</w:t>
       </w:r>
       <w:r>
-        <w:t>ợc yêu</w:t>
-      </w:r>
-      <w:r>
-        <w:t xml:space="preserve"> </w:t>
-      </w:r>
-      <w:r>
-        <w:t>cầu.</w:t>
+        <w:t>ợc yêu cầu.</w:t>
       </w:r>
     </w:p>
     <w:p>
@@ -4729,13 +4654,7 @@
         <w:t>ư</w:t>
       </w:r>
       <w:r>
-        <w:t>ợc mã HTML đó từ Server thì nó sẽ hiển thị ra cửa sổ của</w:t>
-      </w:r>
-      <w:r>
-        <w:t xml:space="preserve"> </w:t>
-      </w:r>
-      <w:r>
-        <w:t xml:space="preserve">trình duyệt một trang </w:t>
+        <w:t xml:space="preserve">ợc mã HTML đó từ Server thì nó sẽ hiển thị ra cửa sổ của trình duyệt một trang </w:t>
       </w:r>
       <w:r>
         <w:t>website</w:t>
@@ -11960,6 +11879,7 @@
   <w:style w:type="character" w:default="1" w:styleId="DefaultParagraphFont">
     <w:name w:val="Default Paragraph Font"/>
     <w:uiPriority w:val="1"/>
+    <w:semiHidden/>
     <w:unhideWhenUsed/>
   </w:style>
   <w:style w:type="table" w:default="1" w:styleId="TableNormal">

</xml_diff>